<commit_message>
Record trusted-context merge and verified Production delivery
</commit_message>
<xml_diff>
--- a/docs/reports/2026-10-16-trusted-identity-context.docx
+++ b/docs/reports/2026-10-16-trusted-identity-context.docx
@@ -688,12 +688,12 @@
     </w:p>
     <w:p>
       <w:r>
-        <w:t>The previous recovery/evaluator/reconciliation branch was integrated with main's separate Analytics change without conflicts. Merge commit a7a68f4 was pushed to main; an independent git ls-remote confirms it on GitHub. Analytics is preserved. The new context slice uses codex/phase-1-trusted-context; its final source commit and merge evidence will be added after staged review.</w:t>
+        <w:t>The previous recovery/evaluator/reconciliation branch was integrated with main's separate Analytics change without conflicts. Merge commit a7a68f4 was pushed to main; an independent git ls-remote confirms it on GitHub. Analytics is preserved. The new context slice is committed as fc6f8a586738b82a3befd6645dff3705aa8a595b on codex/phase-1-trusted-context, pushed and fast-forward merged into main. An independent git ls-remote confirms the same source commit on both remote branches. Only the fourteen reviewed source/test/report files were staged; staged diff validation passes. The user next-env.d.ts edit remains unstaged.</w:t>
       </w:r>
     </w:p>
     <w:p>
       <w:r>
-        <w:t>Production URL: https://virtual-ink.vercel.app At 04:18 UTC all twenty public-page, rendered-image, health and guest-denial smoke checks pass. These checks do not identify the served Git commit or prove genuine Auth/database/files. The approved CLI rerun confirms Production deployment dpl_963Xcve4U3B8NernKyiaj5jrJQqz is READY at https://virtual-o8ta7drjj-shadowrootsec-5679.vercel.app. The first inspect result omits source-commit metadata, so current Git-source linkage is not yet verified. The initial sandbox CLI fetch/credential-access failure is resolved by that rerun. No protection setting or authentication bypass was changed. No phase is complete.</w:t>
+        <w:t>Production URL: https://virtual-ink.vercel.app At 04:18 UTC all twenty public-page, rendered-image, health and guest-denial smoke checks pass. These checks do not identify the served Git commit or prove genuine Auth/database/files. The approved CLI rerun and read-only deployment API now confirm Production deployment dpl_7onH41KaiA46R1pEYVGKxG2av6jT is READY at https://virtual-3wmd22583-shadowrootsec-5679.vercel.app. Inspecting the Production alias resolves to that deployment, with exact source fc6f8a586738b82a3befd6645dff3705aa8a595b on main. At 04:32 UTC, after that source became Ready, a fresh run passes all twenty public-page/image/health/guest checks. Genuine Auth remains unverified. The initial sandbox CLI fetch/credential-access failure is resolved by that rerun. No protection setting or authentication bypass was changed. No phase is complete.</w:t>
       </w:r>
     </w:p>
     <w:p>
@@ -759,7 +759,7 @@
     </w:p>
     <w:p>
       <w:r>
-        <w:t>Word uses the established compact_reference_guide preset, memo_masthead pattern and named report-style overrides. Structural checks pass. The renderer was attempted and failed because LibreOffice is absent (WinError 2); visual pagination remains unverified. Link/privacy checks are recorded before delivery. No human signoff or phase completion is claimed.</w:t>
+        <w:t>Word uses the established compact_reference_guide preset, memo_masthead pattern and named report-style overrides. Structural checks pass. The renderer was attempted and failed because LibreOffice is absent (WinError 2); visual pagination remains unverified. All 176 local links, required report evidence, OOXML and privacy checks pass. No human signoff or phase completion is claimed.</w:t>
       </w:r>
     </w:p>
     <w:sectPr>

</xml_diff>